<commit_message>
Final Adjustments of pre report codes
</commit_message>
<xml_diff>
--- a/5/complete_report.docx
+++ b/5/complete_report.docx
@@ -689,14 +689,12 @@
         </w:rPr>
         <w:t xml:space="preserve">ماژول </w:t>
       </w:r>
-      <w:proofErr w:type="spellStart"/>
       <w:r>
         <w:rPr>
           <w:lang w:bidi="fa-IR"/>
         </w:rPr>
         <w:t>control_unit.v</w:t>
       </w:r>
-      <w:proofErr w:type="spellEnd"/>
       <w:r>
         <w:rPr>
           <w:rFonts w:hint="cs"/>
@@ -728,14 +726,12 @@
         </w:rPr>
         <w:t xml:space="preserve">ماژول </w:t>
       </w:r>
-      <w:proofErr w:type="spellStart"/>
       <w:r>
         <w:rPr>
           <w:lang w:bidi="fa-IR"/>
         </w:rPr>
         <w:t>datapath.v</w:t>
       </w:r>
-      <w:proofErr w:type="spellEnd"/>
       <w:r>
         <w:rPr>
           <w:rFonts w:hint="cs"/>
@@ -767,14 +763,12 @@
         </w:rPr>
         <w:t xml:space="preserve">ماژول </w:t>
       </w:r>
-      <w:proofErr w:type="spellStart"/>
       <w:r>
         <w:rPr>
           <w:lang w:bidi="fa-IR"/>
         </w:rPr>
         <w:t>booth_mult.v</w:t>
       </w:r>
-      <w:proofErr w:type="spellEnd"/>
       <w:r>
         <w:rPr>
           <w:rFonts w:hint="cs"/>
@@ -787,16 +781,8 @@
         <w:rPr>
           <w:lang w:bidi="fa-IR"/>
         </w:rPr>
-        <w:t xml:space="preserve">controller , </w:t>
-      </w:r>
-      <w:proofErr w:type="spellStart"/>
-      <w:r>
-        <w:rPr>
-          <w:lang w:bidi="fa-IR"/>
-        </w:rPr>
-        <w:t>datapath</w:t>
-      </w:r>
-      <w:proofErr w:type="spellEnd"/>
+        <w:t>controller , datapath</w:t>
+      </w:r>
       <w:r>
         <w:rPr>
           <w:rFonts w:hint="cs"/>
@@ -828,14 +814,12 @@
         </w:rPr>
         <w:t xml:space="preserve">ماژول </w:t>
       </w:r>
-      <w:proofErr w:type="spellStart"/>
       <w:r>
         <w:rPr>
           <w:lang w:bidi="fa-IR"/>
         </w:rPr>
         <w:t>find_first_different_bit.v</w:t>
       </w:r>
-      <w:proofErr w:type="spellEnd"/>
       <w:r>
         <w:rPr>
           <w:rFonts w:hint="cs"/>
@@ -867,14 +851,12 @@
         </w:rPr>
         <w:t xml:space="preserve"> و ماژول </w:t>
       </w:r>
-      <w:proofErr w:type="spellStart"/>
       <w:r>
         <w:rPr>
           <w:lang w:bidi="fa-IR"/>
         </w:rPr>
         <w:t>booth_mult_tb.v</w:t>
       </w:r>
-      <w:proofErr w:type="spellEnd"/>
       <w:r>
         <w:rPr>
           <w:rFonts w:hint="cs"/>
@@ -902,14 +884,12 @@
         </w:rPr>
         <w:t xml:space="preserve">طبق فرموده سوال باید </w:t>
       </w:r>
-      <w:proofErr w:type="spellStart"/>
       <w:r>
         <w:rPr>
           <w:lang w:bidi="fa-IR"/>
         </w:rPr>
         <w:t>datapath</w:t>
       </w:r>
-      <w:proofErr w:type="spellEnd"/>
       <w:r>
         <w:rPr>
           <w:rFonts w:hint="cs"/>
@@ -932,14 +912,12 @@
         </w:rPr>
         <w:t xml:space="preserve"> را جدا می‌کردیم و بعد آن دو را به هم وصل می‌کردیم که این کار را با </w:t>
       </w:r>
-      <w:proofErr w:type="spellStart"/>
       <w:r>
         <w:rPr>
           <w:lang w:bidi="fa-IR"/>
         </w:rPr>
         <w:t>boot_mult</w:t>
       </w:r>
-      <w:proofErr w:type="spellEnd"/>
       <w:r>
         <w:rPr>
           <w:rFonts w:hint="cs"/>
@@ -967,14 +945,12 @@
         </w:rPr>
         <w:t xml:space="preserve">بنابراین ماژول </w:t>
       </w:r>
-      <w:proofErr w:type="spellStart"/>
       <w:r>
         <w:rPr>
           <w:lang w:bidi="fa-IR"/>
         </w:rPr>
         <w:t>find_first_different_bit.v</w:t>
       </w:r>
-      <w:proofErr w:type="spellEnd"/>
       <w:r>
         <w:rPr>
           <w:rFonts w:hint="cs"/>
@@ -1120,7 +1096,6 @@
         <w:spacing w:line="360" w:lineRule="auto"/>
         <w:jc w:val="both"/>
         <w:rPr>
-          <w:rFonts w:hint="cs"/>
           <w:rtl/>
           <w:lang w:bidi="fa-IR"/>
         </w:rPr>
@@ -1147,14 +1122,12 @@
         </w:rPr>
         <w:t xml:space="preserve"> به اندازه </w:t>
       </w:r>
-      <w:proofErr w:type="spellStart"/>
       <w:r>
         <w:rPr>
           <w:lang w:bidi="fa-IR"/>
         </w:rPr>
         <w:t>shift_a</w:t>
       </w:r>
-      <w:proofErr w:type="spellEnd"/>
       <w:r>
         <w:rPr>
           <w:rFonts w:hint="cs"/>
@@ -1163,14 +1136,12 @@
         </w:rPr>
         <w:t xml:space="preserve"> در کد. این </w:t>
       </w:r>
-      <w:proofErr w:type="spellStart"/>
       <w:r>
         <w:rPr>
           <w:lang w:bidi="fa-IR"/>
         </w:rPr>
         <w:t>shift_a</w:t>
       </w:r>
-      <w:proofErr w:type="spellEnd"/>
       <w:r>
         <w:rPr>
           <w:rFonts w:hint="cs"/>
@@ -1248,6 +1219,7 @@
       </w:pPr>
       <w:r>
         <w:rPr>
+          <w:noProof/>
           <w:lang w:bidi="fa-IR"/>
         </w:rPr>
         <w:drawing>
@@ -1346,14 +1318,12 @@
         </w:rPr>
         <w:t xml:space="preserve"> است که قبلا هم توضیح داده شد. سیگنال های </w:t>
       </w:r>
-      <w:proofErr w:type="spellStart"/>
       <w:r>
         <w:rPr>
           <w:lang w:bidi="fa-IR"/>
         </w:rPr>
         <w:t>shift_a</w:t>
       </w:r>
-      <w:proofErr w:type="spellEnd"/>
       <w:r>
         <w:rPr>
           <w:rFonts w:hint="cs"/>
@@ -1362,14 +1332,12 @@
         </w:rPr>
         <w:t xml:space="preserve"> و </w:t>
       </w:r>
-      <w:proofErr w:type="spellStart"/>
       <w:r>
         <w:rPr>
           <w:lang w:bidi="fa-IR"/>
         </w:rPr>
         <w:t>shift_b</w:t>
       </w:r>
-      <w:proofErr w:type="spellEnd"/>
       <w:r>
         <w:rPr>
           <w:rFonts w:hint="cs"/>
@@ -1378,14 +1346,12 @@
         </w:rPr>
         <w:t xml:space="preserve"> داریم که تا حدی توضیح داده شد. </w:t>
       </w:r>
-      <w:proofErr w:type="spellStart"/>
       <w:r>
         <w:rPr>
           <w:lang w:bidi="fa-IR"/>
         </w:rPr>
         <w:t>Shift_b</w:t>
       </w:r>
-      <w:proofErr w:type="spellEnd"/>
       <w:r>
         <w:rPr>
           <w:rFonts w:hint="cs"/>
@@ -1394,14 +1360,12 @@
         </w:rPr>
         <w:t xml:space="preserve"> میزان شیفت در کلاک فعلی و </w:t>
       </w:r>
-      <w:proofErr w:type="spellStart"/>
       <w:r>
         <w:rPr>
           <w:lang w:bidi="fa-IR"/>
         </w:rPr>
         <w:t>shift_a</w:t>
       </w:r>
-      <w:proofErr w:type="spellEnd"/>
       <w:r>
         <w:rPr>
           <w:rFonts w:hint="cs"/>
@@ -1486,46 +1450,26 @@
         </w:rPr>
         <w:t xml:space="preserve"> می‌شود. این سگنال بسیار مهمی ست که در کد قبلی وجود نداشت. با اضافه کردن این سیگنال بسیاری از باگ های پیاده سازی حل شدند. سیگنال مهم دیگر سیگنال </w:t>
       </w:r>
-      <w:proofErr w:type="spellStart"/>
       <w:r>
         <w:rPr>
           <w:lang w:bidi="fa-IR"/>
         </w:rPr>
         <w:t>operation_select</w:t>
       </w:r>
-      <w:proofErr w:type="spellEnd"/>
-      <w:r>
-        <w:rPr>
-          <w:rFonts w:hint="cs"/>
-          <w:rtl/>
-          <w:lang w:bidi="fa-IR"/>
-        </w:rPr>
-        <w:t xml:space="preserve"> است. اینکه کدام عملیات (جمع یا تفریق) </w:t>
-      </w:r>
-      <w:r>
-        <w:rPr>
-          <w:rFonts w:hint="cs"/>
-          <w:rtl/>
-          <w:lang w:bidi="fa-IR"/>
-        </w:rPr>
-        <w:t>انجام شود</w:t>
-      </w:r>
-      <w:r>
-        <w:rPr>
-          <w:rFonts w:hint="cs"/>
-          <w:rtl/>
-          <w:lang w:bidi="fa-IR"/>
-        </w:rPr>
-        <w:t xml:space="preserve">. پس از شیفت عدد، اگر بیت سمت راست 1 باشد، یعنی به صورت 01 است و باید جمع صورت گیرد. اگر هم صفر باشد، یعنی 10 است و باید تفریق صورت گیرد. اینکه چه صورت گیرد در واحد کنترلی مشخص می‌شود و اینکه عملیات صورت گیرد، در </w:t>
-      </w:r>
-      <w:proofErr w:type="spellStart"/>
+      <w:r>
+        <w:rPr>
+          <w:rFonts w:hint="cs"/>
+          <w:rtl/>
+          <w:lang w:bidi="fa-IR"/>
+        </w:rPr>
+        <w:t xml:space="preserve"> است. اینکه کدام عملیات (جمع یا تفریق) انجام شود. پس از شیفت عدد، اگر بیت سمت راست 1 باشد، یعنی به صورت 01 است و باید جمع صورت گیرد. اگر هم صفر باشد، یعنی 10 است و باید تفریق صورت گیرد. اینکه چه صورت گیرد در واحد کنترلی مشخص می‌شود و اینکه عملیات صورت گیرد، در </w:t>
+      </w:r>
       <w:r>
         <w:rPr>
           <w:lang w:bidi="fa-IR"/>
         </w:rPr>
         <w:t>datapath</w:t>
       </w:r>
-      <w:proofErr w:type="spellEnd"/>
       <w:r>
         <w:rPr>
           <w:rFonts w:hint="cs"/>
@@ -1584,14 +1528,12 @@
         </w:rPr>
         <w:t xml:space="preserve"> هستیم و چون در ابتدا بیت سمت راست صفر است، باید جایگاه ایندکس راست ترین یک را به عنوان </w:t>
       </w:r>
-      <w:proofErr w:type="spellStart"/>
       <w:r>
         <w:rPr>
           <w:lang w:bidi="fa-IR"/>
         </w:rPr>
         <w:t>shift_b</w:t>
       </w:r>
-      <w:proofErr w:type="spellEnd"/>
       <w:r>
         <w:rPr>
           <w:rFonts w:hint="cs"/>
@@ -1627,14 +1569,12 @@
         </w:rPr>
         <w:t xml:space="preserve">پس از پیاده سازی این مدار ها، این ماژول ها در ماژول </w:t>
       </w:r>
-      <w:proofErr w:type="spellStart"/>
       <w:r>
         <w:rPr>
           <w:lang w:bidi="fa-IR"/>
         </w:rPr>
         <w:t>booth_mult</w:t>
       </w:r>
-      <w:proofErr w:type="spellEnd"/>
       <w:r>
         <w:rPr>
           <w:rFonts w:hint="cs"/>
@@ -1951,7 +1891,6 @@
         <w:spacing w:line="360" w:lineRule="auto"/>
         <w:jc w:val="both"/>
         <w:rPr>
-          <w:rFonts w:hint="cs"/>
           <w:rtl/>
           <w:lang w:bidi="fa-IR"/>
         </w:rPr>
@@ -2018,11 +1957,12 @@
       </w:pPr>
       <w:r>
         <w:rPr>
+          <w:noProof/>
           <w:lang w:bidi="fa-IR"/>
         </w:rPr>
         <w:lastRenderedPageBreak/>
         <w:drawing>
-          <wp:inline distT="0" distB="0" distL="0" distR="0" wp14:anchorId="30D173A8" wp14:editId="65CD4FCD">
+          <wp:inline distT="0" distB="0" distL="0" distR="0" wp14:anchorId="30D173A8" wp14:editId="736FCE84">
             <wp:extent cx="6037384" cy="3570829"/>
             <wp:effectExtent l="0" t="0" r="1905" b="0"/>
             <wp:docPr id="797326477" name="Picture 6"/>
@@ -2077,17 +2017,17 @@
         <w:spacing w:line="360" w:lineRule="auto"/>
         <w:jc w:val="both"/>
         <w:rPr>
-          <w:rFonts w:hint="cs"/>
-          <w:rtl/>
-          <w:lang w:bidi="fa-IR"/>
-        </w:rPr>
-      </w:pPr>
-      <w:r>
-        <w:rPr>
+          <w:rtl/>
+          <w:lang w:bidi="fa-IR"/>
+        </w:rPr>
+      </w:pPr>
+      <w:r>
+        <w:rPr>
+          <w:noProof/>
           <w:lang w:bidi="fa-IR"/>
         </w:rPr>
         <w:drawing>
-          <wp:inline distT="0" distB="0" distL="0" distR="0" wp14:anchorId="47BE3DA2" wp14:editId="66A512C0">
+          <wp:inline distT="0" distB="0" distL="0" distR="0" wp14:anchorId="47BE3DA2" wp14:editId="3D07E883">
             <wp:extent cx="6005331" cy="2760784"/>
             <wp:effectExtent l="0" t="0" r="0" b="1905"/>
             <wp:docPr id="1760914731" name="Picture 8"/>
@@ -2143,14 +2083,12 @@
         </w:rPr>
         <w:t xml:space="preserve">دو شکل پایین هم شماتیک مدار </w:t>
       </w:r>
-      <w:proofErr w:type="spellStart"/>
       <w:r>
         <w:rPr>
           <w:lang w:bidi="fa-IR"/>
         </w:rPr>
         <w:t>control_unit</w:t>
       </w:r>
-      <w:proofErr w:type="spellEnd"/>
       <w:r>
         <w:rPr>
           <w:rFonts w:hint="cs"/>
@@ -2159,14 +2097,12 @@
         </w:rPr>
         <w:t xml:space="preserve"> و </w:t>
       </w:r>
-      <w:proofErr w:type="spellStart"/>
       <w:r>
         <w:rPr>
           <w:lang w:bidi="fa-IR"/>
         </w:rPr>
         <w:t>datapath</w:t>
       </w:r>
-      <w:proofErr w:type="spellEnd"/>
       <w:r>
         <w:rPr>
           <w:rFonts w:hint="cs"/>
@@ -2201,11 +2137,12 @@
       </w:pPr>
       <w:r>
         <w:rPr>
+          <w:noProof/>
           <w:lang w:bidi="fa-IR"/>
         </w:rPr>
         <w:lastRenderedPageBreak/>
         <w:drawing>
-          <wp:inline distT="0" distB="0" distL="0" distR="0" wp14:anchorId="3ADE7D84" wp14:editId="58022DD4">
+          <wp:inline distT="0" distB="0" distL="0" distR="0" wp14:anchorId="3ADE7D84" wp14:editId="70E284A7">
             <wp:extent cx="3528646" cy="2999349"/>
             <wp:effectExtent l="0" t="0" r="0" b="0"/>
             <wp:docPr id="526050807" name="Picture 10"/>
@@ -2265,6 +2202,7 @@
       </w:pPr>
       <w:r>
         <w:rPr>
+          <w:noProof/>
           <w:lang w:bidi="fa-IR"/>
         </w:rPr>
         <w:drawing>
@@ -2376,6 +2314,7 @@
       </w:pPr>
       <w:r>
         <w:rPr>
+          <w:noProof/>
           <w:lang w:bidi="fa-IR"/>
         </w:rPr>
         <w:drawing>
@@ -2434,7 +2373,6 @@
         <w:spacing w:line="360" w:lineRule="auto"/>
         <w:jc w:val="both"/>
         <w:rPr>
-          <w:rFonts w:hint="cs"/>
           <w:rtl/>
           <w:lang w:bidi="fa-IR"/>
         </w:rPr>
@@ -2477,7 +2415,23 @@
           <w:rtl/>
           <w:lang w:bidi="fa-IR"/>
         </w:rPr>
-        <w:t xml:space="preserve">قسمت بعد مربوط به چالش ها و کارهایی ست که در آزمایشگاه انجام دادیم. (تاریخ </w:t>
+        <w:t xml:space="preserve">قسمت بعد مربوط به چالش ها و کارهایی ست که در آزمایشگاه انجام </w:t>
+      </w:r>
+      <w:r>
+        <w:rPr>
+          <w:rFonts w:hint="cs"/>
+          <w:rtl/>
+          <w:lang w:bidi="fa-IR"/>
+        </w:rPr>
+        <w:t>می‌دهیم</w:t>
+      </w:r>
+      <w:r>
+        <w:rPr>
+          <w:rFonts w:hint="cs"/>
+          <w:rtl/>
+          <w:lang w:bidi="fa-IR"/>
+        </w:rPr>
+        <w:t xml:space="preserve">. (تاریخ </w:t>
       </w:r>
       <w:r>
         <w:rPr>
@@ -2527,7 +2481,6 @@
       <w:pPr>
         <w:bidi/>
         <w:rPr>
-          <w:rFonts w:hint="cs"/>
           <w:rtl/>
           <w:lang w:bidi="fa-IR"/>
         </w:rPr>
@@ -2602,7 +2555,6 @@
     <w:pPr>
       <w:pStyle w:val="Header"/>
       <w:rPr>
-        <w:rFonts w:hint="cs"/>
         <w:lang w:bidi="fa-IR"/>
       </w:rPr>
     </w:pPr>
@@ -3342,6 +3294,7 @@
   <w:style w:type="character" w:default="1" w:styleId="DefaultParagraphFont">
     <w:name w:val="Default Paragraph Font"/>
     <w:uiPriority w:val="1"/>
+    <w:semiHidden/>
     <w:unhideWhenUsed/>
   </w:style>
   <w:style w:type="table" w:default="1" w:styleId="TableNormal">

</xml_diff>